<commit_message>
Worked on various merges
</commit_message>
<xml_diff>
--- a/project/documents/reportletters/signoff.docx
+++ b/project/documents/reportletters/signoff.docx
@@ -1,6 +1,6 @@
 
 <file path=word/document.xml><?xml version="1.0" encoding="utf-8"?>
-<w:document xmlns:wpc="http://schemas.microsoft.com/office/word/2010/wordprocessingCanvas" xmlns:cx="http://schemas.microsoft.com/office/drawing/2014/chartex" xmlns:cx1="http://schemas.microsoft.com/office/drawing/2015/9/8/chartex" xmlns:cx2="http://schemas.microsoft.com/office/drawing/2015/10/21/chartex" xmlns:cx3="http://schemas.microsoft.com/office/drawing/2016/5/9/chartex" xmlns:cx4="http://schemas.microsoft.com/office/drawing/2016/5/10/chartex" xmlns:cx5="http://schemas.microsoft.com/office/drawing/2016/5/11/chartex" xmlns:cx6="http://schemas.microsoft.com/office/drawing/2016/5/12/chartex" xmlns:cx7="http://schemas.microsoft.com/office/drawing/2016/5/13/chartex" xmlns:cx8="http://schemas.microsoft.com/office/drawing/2016/5/14/chartex" xmlns:mc="http://schemas.openxmlformats.org/markup-compatibility/2006" xmlns:aink="http://schemas.microsoft.com/office/drawing/2016/ink" xmlns:am3d="http://schemas.microsoft.com/office/drawing/2017/model3d" xmlns:o="urn:schemas-microsoft-com:office:office" xmlns:oel="http://schemas.microsoft.com/office/2019/extlst" xmlns:r="http://schemas.openxmlformats.org/officeDocument/2006/relationships" xmlns:m="http://schemas.openxmlformats.org/officeDocument/2006/math" xmlns:v="urn:schemas-microsoft-com:vml" xmlns:wp14="http://schemas.microsoft.com/office/word/2010/wordprocessingDrawing" xmlns:wp="http://schemas.openxmlformats.org/drawingml/2006/wordprocessingDrawing" xmlns:w10="urn:schemas-microsoft-com:office:word" xmlns:w="http://schemas.openxmlformats.org/wordprocessingml/2006/main" xmlns:w14="http://schemas.microsoft.com/office/word/2010/wordml" xmlns:w15="http://schemas.microsoft.com/office/word/2012/wordml" xmlns:w16cex="http://schemas.microsoft.com/office/word/2018/wordml/cex" xmlns:w16cid="http://schemas.microsoft.com/office/word/2016/wordml/cid" xmlns:w16="http://schemas.microsoft.com/office/word/2018/wordml" xmlns:w16sdtdh="http://schemas.microsoft.com/office/word/2020/wordml/sdtdatahash" xmlns:w16se="http://schemas.microsoft.com/office/word/2015/wordml/symex" xmlns:wpg="http://schemas.microsoft.com/office/word/2010/wordprocessingGroup" xmlns:wpi="http://schemas.microsoft.com/office/word/2010/wordprocessingInk" xmlns:wne="http://schemas.microsoft.com/office/word/2006/wordml" xmlns:wps="http://schemas.microsoft.com/office/word/2010/wordprocessingShape" mc:Ignorable="w14 w15 w16se w16cid w16 w16cex w16sdtdh wp14">
+<w:document xmlns:wpc="http://schemas.microsoft.com/office/word/2010/wordprocessingCanvas" xmlns:cx="http://schemas.microsoft.com/office/drawing/2014/chartex" xmlns:cx1="http://schemas.microsoft.com/office/drawing/2015/9/8/chartex" xmlns:cx2="http://schemas.microsoft.com/office/drawing/2015/10/21/chartex" xmlns:cx3="http://schemas.microsoft.com/office/drawing/2016/5/9/chartex" xmlns:cx4="http://schemas.microsoft.com/office/drawing/2016/5/10/chartex" xmlns:cx5="http://schemas.microsoft.com/office/drawing/2016/5/11/chartex" xmlns:cx6="http://schemas.microsoft.com/office/drawing/2016/5/12/chartex" xmlns:cx7="http://schemas.microsoft.com/office/drawing/2016/5/13/chartex" xmlns:cx8="http://schemas.microsoft.com/office/drawing/2016/5/14/chartex" xmlns:mc="http://schemas.openxmlformats.org/markup-compatibility/2006" xmlns:aink="http://schemas.microsoft.com/office/drawing/2016/ink" xmlns:am3d="http://schemas.microsoft.com/office/drawing/2017/model3d" xmlns:o="urn:schemas-microsoft-com:office:office" xmlns:oel="http://schemas.microsoft.com/office/2019/extlst" xmlns:r="http://schemas.openxmlformats.org/officeDocument/2006/relationships" xmlns:m="http://schemas.openxmlformats.org/officeDocument/2006/math" xmlns:v="urn:schemas-microsoft-com:vml" xmlns:wp14="http://schemas.microsoft.com/office/word/2010/wordprocessingDrawing" xmlns:wp="http://schemas.openxmlformats.org/drawingml/2006/wordprocessingDrawing" xmlns:w10="urn:schemas-microsoft-com:office:word" xmlns:w="http://schemas.openxmlformats.org/wordprocessingml/2006/main" xmlns:w14="http://schemas.microsoft.com/office/word/2010/wordml" xmlns:w15="http://schemas.microsoft.com/office/word/2012/wordml" xmlns:w16cex="http://schemas.microsoft.com/office/word/2018/wordml/cex" xmlns:w16cid="http://schemas.microsoft.com/office/word/2016/wordml/cid" xmlns:w16="http://schemas.microsoft.com/office/word/2018/wordml" xmlns:w16du="http://schemas.microsoft.com/office/word/2023/wordml/word16du" xmlns:w16sdtdh="http://schemas.microsoft.com/office/word/2020/wordml/sdtdatahash" xmlns:w16sdtfl="http://schemas.microsoft.com/office/word/2024/wordml/sdtformatlock" xmlns:w16se="http://schemas.microsoft.com/office/word/2015/wordml/symex" xmlns:wpg="http://schemas.microsoft.com/office/word/2010/wordprocessingGroup" xmlns:wpi="http://schemas.microsoft.com/office/word/2010/wordprocessingInk" xmlns:wne="http://schemas.microsoft.com/office/word/2006/wordml" xmlns:wps="http://schemas.microsoft.com/office/word/2010/wordprocessingShape" mc:Ignorable="w14 w15 w16se w16cid w16 w16cex w16sdtdh w16sdtfl w16du wp14">
   <w:body>
     <w:p>
       <w:r>
@@ -19,11 +19,6 @@
       </w:r>
     </w:p>
     <w:p/>
-    <w:p>
-      <w:r>
-        <w:t xml:space="preserve">Attachments </w:t>
-      </w:r>
-    </w:p>
     <w:p>
       <w:r>
         <w:t xml:space="preserve">This electronic transmission contains information which is confidential and/or privileged. The information is intended for use only by the individual or entity named above. If you are not the intended recipient (or the employee or agent responsible for delivering this information to the intended recipient), you are hereby notified that any use, dissemination, distribution, or copying of this communication is prohibited. If you have received this information in error, please notify me immediately by telephone at 612-373-6900 or by electronic mail and delete all copies of the transmission. Thank you.      </w:t>
@@ -66,7 +61,7 @@
 </file>
 
 <file path=word/styles.xml><?xml version="1.0" encoding="utf-8"?>
-<w:styles xmlns:mc="http://schemas.openxmlformats.org/markup-compatibility/2006" xmlns:r="http://schemas.openxmlformats.org/officeDocument/2006/relationships" xmlns:w="http://schemas.openxmlformats.org/wordprocessingml/2006/main" xmlns:w14="http://schemas.microsoft.com/office/word/2010/wordml" xmlns:w15="http://schemas.microsoft.com/office/word/2012/wordml" xmlns:w16cex="http://schemas.microsoft.com/office/word/2018/wordml/cex" xmlns:w16cid="http://schemas.microsoft.com/office/word/2016/wordml/cid" xmlns:w16="http://schemas.microsoft.com/office/word/2018/wordml" xmlns:w16sdtdh="http://schemas.microsoft.com/office/word/2020/wordml/sdtdatahash" xmlns:w16se="http://schemas.microsoft.com/office/word/2015/wordml/symex" mc:Ignorable="w14 w15 w16se w16cid w16 w16cex w16sdtdh">
+<w:styles xmlns:mc="http://schemas.openxmlformats.org/markup-compatibility/2006" xmlns:r="http://schemas.openxmlformats.org/officeDocument/2006/relationships" xmlns:w="http://schemas.openxmlformats.org/wordprocessingml/2006/main" xmlns:w14="http://schemas.microsoft.com/office/word/2010/wordml" xmlns:w15="http://schemas.microsoft.com/office/word/2012/wordml" xmlns:w16cex="http://schemas.microsoft.com/office/word/2018/wordml/cex" xmlns:w16cid="http://schemas.microsoft.com/office/word/2016/wordml/cid" xmlns:w16="http://schemas.microsoft.com/office/word/2018/wordml" xmlns:w16du="http://schemas.microsoft.com/office/word/2023/wordml/word16du" xmlns:w16sdtdh="http://schemas.microsoft.com/office/word/2020/wordml/sdtdatahash" xmlns:w16sdtfl="http://schemas.microsoft.com/office/word/2024/wordml/sdtformatlock" xmlns:w16se="http://schemas.microsoft.com/office/word/2015/wordml/symex" mc:Ignorable="w14 w15 w16se w16cid w16 w16cex w16sdtdh w16sdtfl w16du">
   <w:docDefaults>
     <w:rPrDefault>
       <w:rPr>

</xml_diff>